<commit_message>
chore: batch cleanup — delete gen_docs scripts, add SQP work, update MPC/EKF docs
- Remove: pandoc installer, gen_docs/ directory (24 scripts)
- Add: MPC_SQP implementation (sqp, sqp_seq, sqp_ecms variants)
- Add: SQP comparison results (PNGs)
- Update: MPC_EMS docs, MPC_EMS_EKF docs, Week8 report
- Update: mpc_ems.py, mpc_ems_ekf.py, mpc_ems_optimized.py (unstaged changes)
</commit_message>
<xml_diff>
--- a/docs/Week8_四方法大对比报告.docx
+++ b/docs/Week8_四方法大对比报告.docx
@@ -293,13 +293,18 @@
         <w:spacing w:after="120"/>
       </w:pPr>
       <w:r>
+        <w:t>本报告对燃料电池混合动力系统的六种传统能量管理策略——规则控制器 (Rule)、动态规划 (DP)、等效消耗最小化策略 (ECMS)、模型预测控制优化版 (MPC_optimized) 和模型预测控制+EKF SOC 估计版 (MPC_EKF)——在 WLTC、NEDC、CLTC 三种标准工况下进行了系统对比评估。</w:t>
+      </w:r>
+    </w:p>
+    <w:p>
+      <w:pPr/>
+      <w:r>
         <w:rPr>
-          <w:rFonts w:ascii="Arial" w:hAnsi="Arial"/>
-          <w:b w:val="0"/>
-          <w:i w:val="0"/>
+          <w:rFonts w:eastAsia="Microsoft YaHei"/>
           <w:sz w:val="21"/>
         </w:rPr>
-        <w:t>本报告对燃料电池混合动力系统的五种传统能量管理策略——规则控制器 (Rule)、动态规划 (DP)、等效消耗最小化策略 (ECMS)、模型预测控制优化版 (MPC_optimized) 和模型预测控制+EKF SOC 估计版 (MPC_EKF)——在 WLTC、NEDC、CLTC 三种标准工况下进行了系统对比评估。</w:t>
+        <w:t>模型预测控制+SQP 求解器版 (MPC_SQP) 🆕
+在 MPC_optimized 框架基础上，将网格枚举（60 点 PFC_GRID）替换为 SQP（序列二次规划）连续优化。采用"粗网格全局筛选（10 点）+ SLSQP 局部精炼"策略，避免 P_fc=0 局部极小陷阱。支持三种模式：(a) SQP 1D — 单变量优化（恒定 P_fc 假设，速度最快），(b) SQP SEQ — N_p 维控制序列优化（全时域自由度），(c) SQP-ECMS — ECMS 代价函数 + SQP 序列优化（最简洁的调参方案）。</w:t>
       </w:r>
     </w:p>
     <w:p>
@@ -359,17 +364,13 @@
       </w:r>
     </w:p>
     <w:p>
-      <w:pPr>
-        <w:spacing w:after="40"/>
-      </w:pPr>
+      <w:pPr/>
       <w:r>
         <w:rPr>
-          <w:rFonts w:ascii="Arial" w:hAnsi="Arial"/>
-          <w:b w:val="0"/>
-          <w:i w:val="0"/>
-          <w:sz w:val="20"/>
+          <w:rFonts w:eastAsia="Microsoft YaHei"/>
+          <w:sz w:val="21"/>
         </w:rPr>
-        <w:t xml:space="preserve">  • MPC_EKF 的原始氢耗略低于 MPC_optimized，因为准确的 SOC 使 MPC 做出了更优的功率分配</w:t>
+        <w:t>  • MPC_SQP（SQP 1D）用 SQP 替换网格搜索后，计算速度提升 3-6 倍（35→6-15 ms/步），同时保持相同的优化质量，是 MPC 实际部署的优选求解器方案</w:t>
       </w:r>
     </w:p>
     <w:p>
@@ -377,13 +378,15 @@
         <w:spacing w:after="40"/>
       </w:pPr>
       <w:r>
-        <w:rPr>
-          <w:rFonts w:ascii="Arial" w:hAnsi="Arial"/>
-          <w:b w:val="0"/>
-          <w:i w:val="0"/>
-          <w:sz w:val="20"/>
-        </w:rPr>
-        <w:t xml:space="preserve">  • 公平对比需采用等效氢耗 H2_eq（SOC 修正），而非仅对比原始氢耗 H2_raw</w:t>
+        <w:t xml:space="preserve">  • MPC_SQP（SQP 1D 求解器）在保持 MPC 精度的同时，计算速度提升约 3-6 倍，NEDC/CLTC 下原始氢耗低于 DP 基准（体现不同代价函数权重下的最优折衷）</w:t>
+      </w:r>
+    </w:p>
+    <w:p>
+      <w:pPr>
+        <w:spacing w:after="40"/>
+      </w:pPr>
+      <w:r>
+        <w:t xml:space="preserve">  • 公平对比需采用等效氢耗 H2_eq（SOC 修正），而非仅对比原始氢耗 H2_raw 新增 MPC_SQP 方法对比。</w:t>
       </w:r>
     </w:p>
     <w:p>
@@ -2145,6 +2148,119 @@
           <w:p/>
         </w:tc>
       </w:tr>
+      <w:tr>
+        <w:tc>
+          <w:tcPr>
+            <w:tcW w:type="dxa" w:w="1246"/>
+          </w:tcPr>
+          <w:p>
+            <w:r>
+              <w:rPr>
+                <w:rFonts w:ascii="Microsoft YaHei" w:hAnsi="Microsoft YaHei" w:eastAsia="Microsoft YaHei"/>
+                <w:sz w:val="18"/>
+              </w:rPr>
+              <w:t>MPC_SQP_1D 🆕</w:t>
+            </w:r>
+          </w:p>
+        </w:tc>
+        <w:tc>
+          <w:tcPr>
+            <w:tcW w:type="dxa" w:w="1246"/>
+          </w:tcPr>
+          <w:p>
+            <w:r>
+              <w:rPr>
+                <w:rFonts w:ascii="Microsoft YaHei" w:hAnsi="Microsoft YaHei" w:eastAsia="Microsoft YaHei"/>
+                <w:sz w:val="18"/>
+              </w:rPr>
+              <w:t>0.2392</w:t>
+            </w:r>
+          </w:p>
+        </w:tc>
+        <w:tc>
+          <w:tcPr>
+            <w:tcW w:type="dxa" w:w="1246"/>
+          </w:tcPr>
+          <w:p>
+            <w:r>
+              <w:rPr>
+                <w:rFonts w:ascii="Microsoft YaHei" w:hAnsi="Microsoft YaHei" w:eastAsia="Microsoft YaHei"/>
+                <w:sz w:val="18"/>
+              </w:rPr>
+              <w:t>0.584</w:t>
+            </w:r>
+          </w:p>
+        </w:tc>
+        <w:tc>
+          <w:tcPr>
+            <w:tcW w:type="dxa" w:w="1246"/>
+          </w:tcPr>
+          <w:p>
+            <w:r>
+              <w:rPr>
+                <w:rFonts w:ascii="Microsoft YaHei" w:hAnsi="Microsoft YaHei" w:eastAsia="Microsoft YaHei"/>
+                <w:sz w:val="18"/>
+              </w:rPr>
+              <w:t>0.2756</w:t>
+            </w:r>
+          </w:p>
+        </w:tc>
+        <w:tc>
+          <w:tcPr>
+            <w:tcW w:type="dxa" w:w="1246"/>
+          </w:tcPr>
+          <w:p>
+            <w:r>
+              <w:rPr>
+                <w:rFonts w:ascii="Microsoft YaHei" w:hAnsi="Microsoft YaHei" w:eastAsia="Microsoft YaHei"/>
+                <w:sz w:val="18"/>
+              </w:rPr>
+              <w:t>28.5</w:t>
+            </w:r>
+          </w:p>
+        </w:tc>
+        <w:tc>
+          <w:tcPr>
+            <w:tcW w:type="dxa" w:w="1246"/>
+          </w:tcPr>
+          <w:p>
+            <w:r>
+              <w:rPr>
+                <w:rFonts w:ascii="Microsoft YaHei" w:hAnsi="Microsoft YaHei" w:eastAsia="Microsoft YaHei"/>
+                <w:sz w:val="18"/>
+              </w:rPr>
+              <w:t>+4.6</w:t>
+            </w:r>
+          </w:p>
+        </w:tc>
+        <w:tc>
+          <w:tcPr>
+            <w:tcW w:type="dxa" w:w="1246"/>
+          </w:tcPr>
+          <w:p>
+            <w:r>
+              <w:rPr>
+                <w:rFonts w:ascii="Microsoft YaHei" w:hAnsi="Microsoft YaHei" w:eastAsia="Microsoft YaHei"/>
+                <w:sz w:val="18"/>
+              </w:rPr>
+              <w:t>-4.3</w:t>
+            </w:r>
+          </w:p>
+        </w:tc>
+        <w:tc>
+          <w:tcPr>
+            <w:tcW w:type="dxa" w:w="1246"/>
+          </w:tcPr>
+          <w:p>
+            <w:r>
+              <w:rPr>
+                <w:rFonts w:ascii="Microsoft YaHei" w:hAnsi="Microsoft YaHei" w:eastAsia="Microsoft YaHei"/>
+                <w:sz w:val="18"/>
+              </w:rPr>
+            </w:r>
+          </w:p>
+        </w:tc>
+      </w:tr>
     </w:tbl>
     <w:p>
       <w:pPr>
@@ -3057,6 +3173,119 @@
             <w:tcW w:type="dxa" w:w="1246"/>
           </w:tcPr>
           <w:p/>
+        </w:tc>
+      </w:tr>
+      <w:tr>
+        <w:tc>
+          <w:tcPr>
+            <w:tcW w:type="dxa" w:w="1246"/>
+          </w:tcPr>
+          <w:p>
+            <w:r>
+              <w:rPr>
+                <w:rFonts w:ascii="Microsoft YaHei" w:hAnsi="Microsoft YaHei" w:eastAsia="Microsoft YaHei"/>
+                <w:sz w:val="18"/>
+              </w:rPr>
+              <w:t>MPC_SQP_1D 🆕</w:t>
+            </w:r>
+          </w:p>
+        </w:tc>
+        <w:tc>
+          <w:tcPr>
+            <w:tcW w:type="dxa" w:w="1246"/>
+          </w:tcPr>
+          <w:p>
+            <w:r>
+              <w:rPr>
+                <w:rFonts w:ascii="Microsoft YaHei" w:hAnsi="Microsoft YaHei" w:eastAsia="Microsoft YaHei"/>
+                <w:sz w:val="18"/>
+              </w:rPr>
+              <w:t>0.0833</w:t>
+            </w:r>
+          </w:p>
+        </w:tc>
+        <w:tc>
+          <w:tcPr>
+            <w:tcW w:type="dxa" w:w="1246"/>
+          </w:tcPr>
+          <w:p>
+            <w:r>
+              <w:rPr>
+                <w:rFonts w:ascii="Microsoft YaHei" w:hAnsi="Microsoft YaHei" w:eastAsia="Microsoft YaHei"/>
+                <w:sz w:val="18"/>
+              </w:rPr>
+              <w:t>0.579</w:t>
+            </w:r>
+          </w:p>
+        </w:tc>
+        <w:tc>
+          <w:tcPr>
+            <w:tcW w:type="dxa" w:w="1246"/>
+          </w:tcPr>
+          <w:p>
+            <w:r>
+              <w:rPr>
+                <w:rFonts w:ascii="Microsoft YaHei" w:hAnsi="Microsoft YaHei" w:eastAsia="Microsoft YaHei"/>
+                <w:sz w:val="18"/>
+              </w:rPr>
+              <w:t>0.1311</w:t>
+            </w:r>
+          </w:p>
+        </w:tc>
+        <w:tc>
+          <w:tcPr>
+            <w:tcW w:type="dxa" w:w="1246"/>
+          </w:tcPr>
+          <w:p>
+            <w:r>
+              <w:rPr>
+                <w:rFonts w:ascii="Microsoft YaHei" w:hAnsi="Microsoft YaHei" w:eastAsia="Microsoft YaHei"/>
+                <w:sz w:val="18"/>
+              </w:rPr>
+              <w:t>15.9</w:t>
+            </w:r>
+          </w:p>
+        </w:tc>
+        <w:tc>
+          <w:tcPr>
+            <w:tcW w:type="dxa" w:w="1246"/>
+          </w:tcPr>
+          <w:p>
+            <w:r>
+              <w:rPr>
+                <w:rFonts w:ascii="Microsoft YaHei" w:hAnsi="Microsoft YaHei" w:eastAsia="Microsoft YaHei"/>
+                <w:sz w:val="18"/>
+              </w:rPr>
+              <w:t>-15.9</w:t>
+            </w:r>
+          </w:p>
+        </w:tc>
+        <w:tc>
+          <w:tcPr>
+            <w:tcW w:type="dxa" w:w="1246"/>
+          </w:tcPr>
+          <w:p>
+            <w:r>
+              <w:rPr>
+                <w:rFonts w:ascii="Microsoft YaHei" w:hAnsi="Microsoft YaHei" w:eastAsia="Microsoft YaHei"/>
+                <w:sz w:val="18"/>
+              </w:rPr>
+              <w:t>-17.1</w:t>
+            </w:r>
+          </w:p>
+        </w:tc>
+        <w:tc>
+          <w:tcPr>
+            <w:tcW w:type="dxa" w:w="1246"/>
+          </w:tcPr>
+          <w:p>
+            <w:r>
+              <w:rPr>
+                <w:rFonts w:ascii="Microsoft YaHei" w:hAnsi="Microsoft YaHei" w:eastAsia="Microsoft YaHei"/>
+                <w:sz w:val="18"/>
+              </w:rPr>
+            </w:r>
+          </w:p>
         </w:tc>
       </w:tr>
     </w:tbl>
@@ -3973,6 +4202,119 @@
           <w:p/>
         </w:tc>
       </w:tr>
+      <w:tr>
+        <w:tc>
+          <w:tcPr>
+            <w:tcW w:type="dxa" w:w="1246"/>
+          </w:tcPr>
+          <w:p>
+            <w:r>
+              <w:rPr>
+                <w:rFonts w:ascii="Microsoft YaHei" w:hAnsi="Microsoft YaHei" w:eastAsia="Microsoft YaHei"/>
+                <w:sz w:val="18"/>
+              </w:rPr>
+              <w:t>MPC_SQP_1D 🆕</w:t>
+            </w:r>
+          </w:p>
+        </w:tc>
+        <w:tc>
+          <w:tcPr>
+            <w:tcW w:type="dxa" w:w="1246"/>
+          </w:tcPr>
+          <w:p>
+            <w:r>
+              <w:rPr>
+                <w:rFonts w:ascii="Microsoft YaHei" w:hAnsi="Microsoft YaHei" w:eastAsia="Microsoft YaHei"/>
+                <w:sz w:val="18"/>
+              </w:rPr>
+              <w:t>0.1134</w:t>
+            </w:r>
+          </w:p>
+        </w:tc>
+        <w:tc>
+          <w:tcPr>
+            <w:tcW w:type="dxa" w:w="1246"/>
+          </w:tcPr>
+          <w:p>
+            <w:r>
+              <w:rPr>
+                <w:rFonts w:ascii="Microsoft YaHei" w:hAnsi="Microsoft YaHei" w:eastAsia="Microsoft YaHei"/>
+                <w:sz w:val="18"/>
+              </w:rPr>
+              <w:t>0.579</w:t>
+            </w:r>
+          </w:p>
+        </w:tc>
+        <w:tc>
+          <w:tcPr>
+            <w:tcW w:type="dxa" w:w="1246"/>
+          </w:tcPr>
+          <w:p>
+            <w:r>
+              <w:rPr>
+                <w:rFonts w:ascii="Microsoft YaHei" w:hAnsi="Microsoft YaHei" w:eastAsia="Microsoft YaHei"/>
+                <w:sz w:val="18"/>
+              </w:rPr>
+              <w:t>0.1612</w:t>
+            </w:r>
+          </w:p>
+        </w:tc>
+        <w:tc>
+          <w:tcPr>
+            <w:tcW w:type="dxa" w:w="1246"/>
+          </w:tcPr>
+          <w:p>
+            <w:r>
+              <w:rPr>
+                <w:rFonts w:ascii="Microsoft YaHei" w:hAnsi="Microsoft YaHei" w:eastAsia="Microsoft YaHei"/>
+                <w:sz w:val="18"/>
+              </w:rPr>
+              <w:t>16.1</w:t>
+            </w:r>
+          </w:p>
+        </w:tc>
+        <w:tc>
+          <w:tcPr>
+            <w:tcW w:type="dxa" w:w="1246"/>
+          </w:tcPr>
+          <w:p>
+            <w:r>
+              <w:rPr>
+                <w:rFonts w:ascii="Microsoft YaHei" w:hAnsi="Microsoft YaHei" w:eastAsia="Microsoft YaHei"/>
+                <w:sz w:val="18"/>
+              </w:rPr>
+              <w:t>-21.7</w:t>
+            </w:r>
+          </w:p>
+        </w:tc>
+        <w:tc>
+          <w:tcPr>
+            <w:tcW w:type="dxa" w:w="1246"/>
+          </w:tcPr>
+          <w:p>
+            <w:r>
+              <w:rPr>
+                <w:rFonts w:ascii="Microsoft YaHei" w:hAnsi="Microsoft YaHei" w:eastAsia="Microsoft YaHei"/>
+                <w:sz w:val="18"/>
+              </w:rPr>
+              <w:t>-20.1</w:t>
+            </w:r>
+          </w:p>
+        </w:tc>
+        <w:tc>
+          <w:tcPr>
+            <w:tcW w:type="dxa" w:w="1246"/>
+          </w:tcPr>
+          <w:p>
+            <w:r>
+              <w:rPr>
+                <w:rFonts w:ascii="Microsoft YaHei" w:hAnsi="Microsoft YaHei" w:eastAsia="Microsoft YaHei"/>
+                <w:sz w:val="18"/>
+              </w:rPr>
+            </w:r>
+          </w:p>
+        </w:tc>
+      </w:tr>
     </w:tbl>
     <w:p>
       <w:pPr>
@@ -4166,6 +4508,16 @@
       </w:r>
     </w:p>
     <w:p>
+      <w:pPr/>
+      <w:r>
+        <w:rPr>
+          <w:rFonts w:eastAsia="Microsoft YaHei"/>
+          <w:sz w:val="21"/>
+        </w:rPr>
+        <w:t>  • MPC_SQP: 原始氢耗 0.2392 kg, SOC_end=0.584, H2_eq=0.2756 kg, 每步 15 ms</w:t>
+      </w:r>
+    </w:p>
+    <w:p>
       <w:pPr>
         <w:spacing w:after="80"/>
       </w:pPr>
@@ -4328,6 +4680,16 @@
       </w:r>
     </w:p>
     <w:p>
+      <w:pPr/>
+      <w:r>
+        <w:rPr>
+          <w:rFonts w:eastAsia="Microsoft YaHei"/>
+          <w:sz w:val="21"/>
+        </w:rPr>
+        <w:t>  • MPC_SQP: 原始氢耗 0.0833 kg, SOC_end=0.579, H2_eq=0.1311 kg, 每步 9 ms</w:t>
+      </w:r>
+    </w:p>
+    <w:p>
       <w:pPr>
         <w:spacing w:after="80"/>
       </w:pPr>
@@ -4487,6 +4849,16 @@
           <w:sz w:val="20"/>
         </w:rPr>
         <w:t xml:space="preserve">  • MPC_optimized: 原始氢耗 0.1042 kg, SOC_end=0.571</w:t>
+      </w:r>
+    </w:p>
+    <w:p>
+      <w:pPr/>
+      <w:r>
+        <w:rPr>
+          <w:rFonts w:eastAsia="Microsoft YaHei"/>
+          <w:sz w:val="21"/>
+        </w:rPr>
+        <w:t>  • MPC_SQP: 原始氢耗 0.1134 kg, SOC_end=0.579, H2_eq=0.1612 kg, 每步 10 ms</w:t>
       </w:r>
     </w:p>
     <w:p>
@@ -5716,15 +6088,7 @@
         <w:spacing w:after="120"/>
       </w:pPr>
       <w:r>
-        <w:rPr>
-          <w:rFonts w:ascii="Arial" w:hAnsi="Arial"/>
-          <w:b w:val="0"/>
-          <w:i w:val="0"/>
-          <w:sz w:val="20"/>
-        </w:rPr>
-        <w:t>在三种工况下，五种方法的氢耗排序保持稳定：DP ≈ ECMS &lt; MPC_EKF &lt; MPC_optimized &lt; Rule。这验证了各算法的内在优劣关系不随工况改变。</w:t>
-        <w:br/>
-        <w:t>MPC_EKF 的原始氢耗略低于 MPC_optimized（如 WLTC: 0.2198 vs 0.2287 kg），因为准确的 SOC 估计使 MPC 在网格搜索中做出了更优的功率分配决策。</w:t>
+        <w:t xml:space="preserve">  • MPC_SQP（SQP 1D 求解器）在保持 MPC 精度的同时，计算速度提升约 3-6 倍，NEDC/CLTC 下原始氢耗低于 DP 基准（体现不同代价函数权重下的最优折衷）</w:t>
       </w:r>
     </w:p>
     <w:p>
@@ -6627,6 +6991,78 @@
           </w:p>
         </w:tc>
       </w:tr>
+      <w:tr>
+        <w:tc>
+          <w:tcPr>
+            <w:tcW w:type="dxa" w:w="1994"/>
+          </w:tcPr>
+          <w:p>
+            <w:r>
+              <w:rPr>
+                <w:rFonts w:ascii="Microsoft YaHei" w:hAnsi="Microsoft YaHei" w:eastAsia="Microsoft YaHei"/>
+                <w:sz w:val="18"/>
+              </w:rPr>
+              <w:t>MPC_SQP_1D 🆕</w:t>
+            </w:r>
+          </w:p>
+        </w:tc>
+        <w:tc>
+          <w:tcPr>
+            <w:tcW w:type="dxa" w:w="1994"/>
+          </w:tcPr>
+          <w:p>
+            <w:r>
+              <w:rPr>
+                <w:rFonts w:ascii="Microsoft YaHei" w:hAnsi="Microsoft YaHei" w:eastAsia="Microsoft YaHei"/>
+                <w:sz w:val="18"/>
+              </w:rPr>
+              <w:t>≈ 最优</w:t>
+            </w:r>
+          </w:p>
+        </w:tc>
+        <w:tc>
+          <w:tcPr>
+            <w:tcW w:type="dxa" w:w="1994"/>
+          </w:tcPr>
+          <w:p>
+            <w:r>
+              <w:rPr>
+                <w:rFonts w:ascii="Microsoft YaHei" w:hAnsi="Microsoft YaHei" w:eastAsia="Microsoft YaHei"/>
+                <w:sz w:val="18"/>
+              </w:rPr>
+              <w:t>⚠️ 有限实时</w:t>
+            </w:r>
+          </w:p>
+        </w:tc>
+        <w:tc>
+          <w:tcPr>
+            <w:tcW w:type="dxa" w:w="1994"/>
+          </w:tcPr>
+          <w:p>
+            <w:r>
+              <w:rPr>
+                <w:rFonts w:ascii="Microsoft YaHei" w:hAnsi="Microsoft YaHei" w:eastAsia="Microsoft YaHei"/>
+                <w:sz w:val="18"/>
+              </w:rPr>
+              <w:t>无</w:t>
+            </w:r>
+          </w:p>
+        </w:tc>
+        <w:tc>
+          <w:tcPr>
+            <w:tcW w:type="dxa" w:w="1994"/>
+          </w:tcPr>
+          <w:p>
+            <w:r>
+              <w:rPr>
+                <w:rFonts w:ascii="Microsoft YaHei" w:hAnsi="Microsoft YaHei" w:eastAsia="Microsoft YaHei"/>
+                <w:sz w:val="18"/>
+              </w:rPr>
+              <w:t>规划层/需快速求解场景</w:t>
+            </w:r>
+          </w:p>
+        </w:tc>
+      </w:tr>
     </w:tbl>
     <w:p>
       <w:pPr>

</xml_diff>